<commit_message>
chore: expand curated showcase data and materials
</commit_message>
<xml_diff>
--- a/softcopyright/2、[心湖匿名心理关怀系统软件]软著登记申请书.docx
+++ b/softcopyright/2、[心湖匿名心理关怀系统软件]软著登记申请书.docx
@@ -4,7 +4,7 @@
   <w:body>
     <w:p>
       <w:pPr>
-        <w:spacing w:before="960"/>
+        <w:spacing w:before="1600"/>
         <w:jc w:val="center"/>
       </w:pPr>
       <w:r>
@@ -13,7 +13,7 @@
           <w:b/>
           <w:sz w:val="44"/>
         </w:rPr>
-        <w:t>计算机软件著作权登记申请表</w:t>
+        <w:t>心湖匿名心理关怀系统软件V1.0</w:t>
       </w:r>
     </w:p>
     <w:p>
@@ -22,11 +22,63 @@
       </w:pPr>
       <w:r>
         <w:rPr>
-          <w:rFonts w:ascii="黑体" w:hAnsi="黑体" w:eastAsia="黑体"/>
-          <w:b/>
-          <w:sz w:val="36"/>
+          <w:rFonts w:ascii="宋体" w:hAnsi="宋体" w:eastAsia="宋体"/>
+          <w:sz w:val="28"/>
         </w:rPr>
-        <w:t>客户软件著作权信息采集卡</w:t>
+        <w:t>计算机软件著作权登记申请书</w:t>
+      </w:r>
+    </w:p>
+    <w:p>
+      <w:pPr>
+        <w:jc w:val="center"/>
+      </w:pPr>
+      <w:r>
+        <w:rPr>
+          <w:rFonts w:ascii="宋体" w:hAnsi="宋体" w:eastAsia="宋体"/>
+          <w:sz w:val="26"/>
+        </w:rPr>
+        <w:t>软件名称：心湖匿名心理关怀系统软件</w:t>
+      </w:r>
+    </w:p>
+    <w:p>
+      <w:pPr>
+        <w:jc w:val="center"/>
+      </w:pPr>
+      <w:r>
+        <w:rPr>
+          <w:rFonts w:ascii="宋体" w:hAnsi="宋体" w:eastAsia="宋体"/>
+          <w:sz w:val="26"/>
+        </w:rPr>
+        <w:t>版本号：V1.0</w:t>
+      </w:r>
+    </w:p>
+    <w:p>
+      <w:pPr>
+        <w:jc w:val="center"/>
+      </w:pPr>
+      <w:r>
+        <w:rPr>
+          <w:rFonts w:ascii="宋体" w:hAnsi="宋体" w:eastAsia="宋体"/>
+          <w:sz w:val="26"/>
+        </w:rPr>
+        <w:t>软件简称：HeartLake</w:t>
+      </w:r>
+    </w:p>
+    <w:p>
+      <w:pPr>
+        <w:jc w:val="center"/>
+      </w:pPr>
+      <w:r>
+        <w:rPr>
+          <w:rFonts w:ascii="宋体" w:hAnsi="宋体" w:eastAsia="宋体"/>
+          <w:sz w:val="26"/>
+        </w:rPr>
+        <w:t>编制日期：2026年4月25日</w:t>
+      </w:r>
+    </w:p>
+    <w:p>
+      <w:r>
+        <w:br w:type="page"/>
       </w:r>
     </w:p>
     <w:p>
@@ -37,59 +89,57 @@
         <w:rPr>
           <w:rFonts w:ascii="黑体" w:hAnsi="黑体" w:eastAsia="黑体"/>
           <w:b/>
-          <w:sz w:val="32"/>
+          <w:sz w:val="30"/>
         </w:rPr>
-        <w:t>一、软件基本信息</w:t>
+        <w:t>一、申请软件基本信息</w:t>
       </w:r>
     </w:p>
     <w:tbl>
       <w:tblPr>
         <w:tblStyle w:val="TableGrid"/>
         <w:tblW w:type="auto" w:w="0"/>
-        <w:jc w:val="center"/>
         <w:tblLook w:firstColumn="1" w:firstRow="1" w:lastColumn="0" w:lastRow="0" w:noHBand="0" w:noVBand="1" w:val="04A0"/>
       </w:tblPr>
       <w:tblGrid>
-        <w:gridCol w:w="4621"/>
-        <w:gridCol w:w="4621"/>
+        <w:gridCol w:w="4592"/>
+        <w:gridCol w:w="4592"/>
       </w:tblGrid>
       <w:tr>
         <w:tc>
           <w:tcPr>
             <w:tcW w:type="dxa" w:w="2268"/>
-            <w:shd w:fill="F2F2F2"/>
-            <w:vAlign w:val="center"/>
+            <w:shd w:fill="EAF3F0"/>
           </w:tcPr>
           <w:p>
             <w:pPr>
-              <w:spacing w:after="0"/>
+              <w:jc w:val="center"/>
             </w:pPr>
             <w:r>
               <w:rPr>
-                <w:rFonts w:ascii="宋体" w:hAnsi="宋体" w:eastAsia="宋体"/>
+                <w:rFonts w:ascii="黑体" w:hAnsi="黑体" w:eastAsia="黑体"/>
                 <w:b/>
                 <w:sz w:val="21"/>
               </w:rPr>
-              <w:t>软件名称</w:t>
+              <w:t>项目</w:t>
             </w:r>
           </w:p>
         </w:tc>
         <w:tc>
           <w:tcPr>
-            <w:tcW w:type="dxa" w:w="6463"/>
-            <w:vAlign w:val="center"/>
+            <w:tcW w:type="dxa" w:w="6236"/>
+            <w:shd w:fill="EAF3F0"/>
           </w:tcPr>
           <w:p>
             <w:pPr>
-              <w:spacing w:after="0"/>
+              <w:jc w:val="center"/>
             </w:pPr>
             <w:r>
               <w:rPr>
-                <w:rFonts w:ascii="宋体" w:hAnsi="宋体" w:eastAsia="宋体"/>
-                <w:b w:val="0"/>
+                <w:rFonts w:ascii="黑体" w:hAnsi="黑体" w:eastAsia="黑体"/>
+                <w:b/>
                 <w:sz w:val="21"/>
               </w:rPr>
-              <w:t>心湖匿名心理关怀系统软件</w:t>
+              <w:t>填写内容</w:t>
             </w:r>
           </w:p>
         </w:tc>
@@ -98,39 +148,28 @@
         <w:tc>
           <w:tcPr>
             <w:tcW w:type="dxa" w:w="2268"/>
-            <w:shd w:fill="F2F2F2"/>
-            <w:vAlign w:val="center"/>
           </w:tcPr>
           <w:p>
-            <w:pPr>
-              <w:spacing w:after="0"/>
-            </w:pPr>
             <w:r>
               <w:rPr>
                 <w:rFonts w:ascii="宋体" w:hAnsi="宋体" w:eastAsia="宋体"/>
-                <w:b/>
-                <w:sz w:val="21"/>
+                <w:sz w:val="20"/>
               </w:rPr>
-              <w:t>版本号</w:t>
+              <w:t>软件全称</w:t>
             </w:r>
           </w:p>
         </w:tc>
         <w:tc>
           <w:tcPr>
-            <w:tcW w:type="dxa" w:w="6463"/>
-            <w:vAlign w:val="center"/>
+            <w:tcW w:type="dxa" w:w="6236"/>
           </w:tcPr>
           <w:p>
-            <w:pPr>
-              <w:spacing w:after="0"/>
-            </w:pPr>
             <w:r>
               <w:rPr>
                 <w:rFonts w:ascii="宋体" w:hAnsi="宋体" w:eastAsia="宋体"/>
-                <w:b w:val="0"/>
-                <w:sz w:val="21"/>
+                <w:sz w:val="20"/>
               </w:rPr>
-              <w:t>V1.0</w:t>
+              <w:t>心湖匿名心理关怀系统软件V1.0</w:t>
             </w:r>
           </w:p>
         </w:tc>
@@ -139,18 +178,12 @@
         <w:tc>
           <w:tcPr>
             <w:tcW w:type="dxa" w:w="2268"/>
-            <w:shd w:fill="F2F2F2"/>
-            <w:vAlign w:val="center"/>
           </w:tcPr>
           <w:p>
-            <w:pPr>
-              <w:spacing w:after="0"/>
-            </w:pPr>
             <w:r>
               <w:rPr>
                 <w:rFonts w:ascii="宋体" w:hAnsi="宋体" w:eastAsia="宋体"/>
-                <w:b/>
-                <w:sz w:val="21"/>
+                <w:sz w:val="20"/>
               </w:rPr>
               <w:t>软件简称</w:t>
             </w:r>
@@ -158,20 +191,15 @@
         </w:tc>
         <w:tc>
           <w:tcPr>
-            <w:tcW w:type="dxa" w:w="6463"/>
-            <w:vAlign w:val="center"/>
+            <w:tcW w:type="dxa" w:w="6236"/>
           </w:tcPr>
           <w:p>
-            <w:pPr>
-              <w:spacing w:after="0"/>
-            </w:pPr>
             <w:r>
               <w:rPr>
                 <w:rFonts w:ascii="宋体" w:hAnsi="宋体" w:eastAsia="宋体"/>
-                <w:b w:val="0"/>
-                <w:sz w:val="21"/>
+                <w:sz w:val="20"/>
               </w:rPr>
-              <w:t>HeartLake / 心湖</w:t>
+              <w:t>HeartLake</w:t>
             </w:r>
           </w:p>
         </w:tc>
@@ -180,18 +208,12 @@
         <w:tc>
           <w:tcPr>
             <w:tcW w:type="dxa" w:w="2268"/>
-            <w:shd w:fill="F2F2F2"/>
-            <w:vAlign w:val="center"/>
           </w:tcPr>
           <w:p>
-            <w:pPr>
-              <w:spacing w:after="0"/>
-            </w:pPr>
             <w:r>
               <w:rPr>
                 <w:rFonts w:ascii="宋体" w:hAnsi="宋体" w:eastAsia="宋体"/>
-                <w:b/>
-                <w:sz w:val="21"/>
+                <w:sz w:val="20"/>
               </w:rPr>
               <w:t>软件分类</w:t>
             </w:r>
@@ -199,20 +221,15 @@
         </w:tc>
         <w:tc>
           <w:tcPr>
-            <w:tcW w:type="dxa" w:w="6463"/>
-            <w:vAlign w:val="center"/>
+            <w:tcW w:type="dxa" w:w="6236"/>
           </w:tcPr>
           <w:p>
-            <w:pPr>
-              <w:spacing w:after="0"/>
-            </w:pPr>
             <w:r>
               <w:rPr>
                 <w:rFonts w:ascii="宋体" w:hAnsi="宋体" w:eastAsia="宋体"/>
-                <w:b w:val="0"/>
-                <w:sz w:val="21"/>
+                <w:sz w:val="20"/>
               </w:rPr>
-              <w:t>☑ 应用软件  □ 嵌入式软件  □ 中间件  □ 操作系统</w:t>
+              <w:t>应用软件 / 匿名心理关怀、情绪记录与互动推荐系统</w:t>
             </w:r>
           </w:p>
         </w:tc>
@@ -221,39 +238,28 @@
         <w:tc>
           <w:tcPr>
             <w:tcW w:type="dxa" w:w="2268"/>
-            <w:shd w:fill="F2F2F2"/>
-            <w:vAlign w:val="center"/>
           </w:tcPr>
           <w:p>
-            <w:pPr>
-              <w:spacing w:after="0"/>
-            </w:pPr>
             <w:r>
               <w:rPr>
                 <w:rFonts w:ascii="宋体" w:hAnsi="宋体" w:eastAsia="宋体"/>
-                <w:b/>
-                <w:sz w:val="21"/>
+                <w:sz w:val="20"/>
               </w:rPr>
-              <w:t>软件作品说明</w:t>
+              <w:t>开发方式</w:t>
             </w:r>
           </w:p>
         </w:tc>
         <w:tc>
           <w:tcPr>
-            <w:tcW w:type="dxa" w:w="6463"/>
-            <w:vAlign w:val="center"/>
+            <w:tcW w:type="dxa" w:w="6236"/>
           </w:tcPr>
           <w:p>
-            <w:pPr>
-              <w:spacing w:after="0"/>
-            </w:pPr>
             <w:r>
               <w:rPr>
                 <w:rFonts w:ascii="宋体" w:hAnsi="宋体" w:eastAsia="宋体"/>
-                <w:b w:val="0"/>
-                <w:sz w:val="21"/>
+                <w:sz w:val="20"/>
               </w:rPr>
-              <w:t>☑ 原创  □ 修改（含翻译软件、合成软件）</w:t>
+              <w:t>独立开发</w:t>
             </w:r>
           </w:p>
         </w:tc>
@@ -262,18 +268,12 @@
         <w:tc>
           <w:tcPr>
             <w:tcW w:type="dxa" w:w="2268"/>
-            <w:shd w:fill="F2F2F2"/>
-            <w:vAlign w:val="center"/>
           </w:tcPr>
           <w:p>
-            <w:pPr>
-              <w:spacing w:after="0"/>
-            </w:pPr>
             <w:r>
               <w:rPr>
                 <w:rFonts w:ascii="宋体" w:hAnsi="宋体" w:eastAsia="宋体"/>
-                <w:b/>
-                <w:sz w:val="21"/>
+                <w:sz w:val="20"/>
               </w:rPr>
               <w:t>开发完成日期</w:t>
             </w:r>
@@ -281,20 +281,15 @@
         </w:tc>
         <w:tc>
           <w:tcPr>
-            <w:tcW w:type="dxa" w:w="6463"/>
-            <w:vAlign w:val="center"/>
+            <w:tcW w:type="dxa" w:w="6236"/>
           </w:tcPr>
           <w:p>
-            <w:pPr>
-              <w:spacing w:after="0"/>
-            </w:pPr>
             <w:r>
               <w:rPr>
                 <w:rFonts w:ascii="宋体" w:hAnsi="宋体" w:eastAsia="宋体"/>
-                <w:b w:val="0"/>
-                <w:sz w:val="21"/>
+                <w:sz w:val="20"/>
               </w:rPr>
-              <w:t>2026年4月10日（按当前仓库最新提交日期填写）</w:t>
+              <w:t>2026年4月25日（本次代码修复、展示数据扩充与申报材料整理完成日期）</w:t>
             </w:r>
           </w:p>
         </w:tc>
@@ -303,72 +298,28 @@
         <w:tc>
           <w:tcPr>
             <w:tcW w:type="dxa" w:w="2268"/>
-            <w:shd w:fill="F2F2F2"/>
-            <w:vAlign w:val="center"/>
           </w:tcPr>
           <w:p>
-            <w:pPr>
-              <w:spacing w:after="0"/>
-            </w:pPr>
             <w:r>
               <w:rPr>
                 <w:rFonts w:ascii="宋体" w:hAnsi="宋体" w:eastAsia="宋体"/>
-                <w:b/>
-                <w:sz w:val="21"/>
+                <w:sz w:val="20"/>
               </w:rPr>
-              <w:t>发表状态</w:t>
+              <w:t>首次公开发表情况</w:t>
             </w:r>
           </w:p>
         </w:tc>
         <w:tc>
           <w:tcPr>
-            <w:tcW w:type="dxa" w:w="6463"/>
-            <w:vAlign w:val="center"/>
+            <w:tcW w:type="dxa" w:w="6236"/>
           </w:tcPr>
           <w:p>
-            <w:pPr>
-              <w:spacing w:after="0"/>
-            </w:pPr>
             <w:r>
               <w:rPr>
                 <w:rFonts w:ascii="宋体" w:hAnsi="宋体" w:eastAsia="宋体"/>
-                <w:b w:val="0"/>
-                <w:sz w:val="21"/>
+                <w:sz w:val="20"/>
               </w:rPr>
-              <w:t>☑ 已发表</w:t>
-            </w:r>
-            <w:r>
-              <w:br/>
-            </w:r>
-            <w:r>
-              <w:rPr>
-                <w:rFonts w:ascii="宋体" w:hAnsi="宋体" w:eastAsia="宋体"/>
-                <w:b w:val="0"/>
-                <w:sz w:val="21"/>
-              </w:rPr>
-              <w:t>首次发表/公网复核日期：2026年4月24日（按本次公网复核日期填写；如你掌握更早首次公开日期，提交前请替换）</w:t>
-            </w:r>
-            <w:r>
-              <w:br/>
-            </w:r>
-            <w:r>
-              <w:rPr>
-                <w:rFonts w:ascii="宋体" w:hAnsi="宋体" w:eastAsia="宋体"/>
-                <w:b w:val="0"/>
-                <w:sz w:val="21"/>
-              </w:rPr>
-              <w:t>首次发表地点：安徽省芜湖市 / 互联网公网入口 http://121.41.195.165</w:t>
-            </w:r>
-            <w:r>
-              <w:br/>
-            </w:r>
-            <w:r>
-              <w:rPr>
-                <w:rFonts w:ascii="宋体" w:hAnsi="宋体" w:eastAsia="宋体"/>
-                <w:b w:val="0"/>
-                <w:sz w:val="21"/>
-              </w:rPr>
-              <w:t>说明：该日期为本次可核验云端部署日期；若申请人掌握更早首次公开日期，应按真实首次公开日期替换。</w:t>
+              <w:t>已在云端部署并复核访问，公网地址为 http://121.41.195.165；如申请主体掌握更早首次公开日期，提交前应以实际日期替换。</w:t>
             </w:r>
           </w:p>
         </w:tc>
@@ -377,44 +328,34 @@
         <w:tc>
           <w:tcPr>
             <w:tcW w:type="dxa" w:w="2268"/>
-            <w:shd w:fill="F2F2F2"/>
-            <w:vAlign w:val="center"/>
           </w:tcPr>
           <w:p>
-            <w:pPr>
-              <w:spacing w:after="0"/>
-            </w:pPr>
             <w:r>
               <w:rPr>
                 <w:rFonts w:ascii="宋体" w:hAnsi="宋体" w:eastAsia="宋体"/>
-                <w:b/>
-                <w:sz w:val="21"/>
+                <w:sz w:val="20"/>
               </w:rPr>
-              <w:t>开发方式</w:t>
+              <w:t>运行环境</w:t>
             </w:r>
           </w:p>
         </w:tc>
         <w:tc>
           <w:tcPr>
-            <w:tcW w:type="dxa" w:w="6463"/>
-            <w:vAlign w:val="center"/>
+            <w:tcW w:type="dxa" w:w="6236"/>
           </w:tcPr>
           <w:p>
-            <w:pPr>
-              <w:spacing w:after="0"/>
-            </w:pPr>
             <w:r>
               <w:rPr>
                 <w:rFonts w:ascii="宋体" w:hAnsi="宋体" w:eastAsia="宋体"/>
-                <w:b w:val="0"/>
-                <w:sz w:val="21"/>
+                <w:sz w:val="20"/>
               </w:rPr>
-              <w:t>☑ 合作开发  □ 独立开发  □ 委托开发  □ 下达任务开发</w:t>
+              <w:t>Android、Web 浏览器、Linux 服务端、PostgreSQL/Redis/Nginx/Drogon/Flutter/Vue 管理端</w:t>
             </w:r>
           </w:p>
         </w:tc>
       </w:tr>
     </w:tbl>
+    <w:p/>
     <w:p>
       <w:pPr>
         <w:pStyle w:val="Heading1"/>
@@ -423,92 +364,83 @@
         <w:rPr>
           <w:rFonts w:ascii="黑体" w:hAnsi="黑体" w:eastAsia="黑体"/>
           <w:b/>
-          <w:sz w:val="32"/>
+          <w:sz w:val="30"/>
         </w:rPr>
-        <w:t>二、著作权人信息</w:t>
+        <w:t>二、软件功能与技术特点</w:t>
+      </w:r>
+    </w:p>
+    <w:p>
+      <w:pPr>
+        <w:ind w:firstLine="420"/>
+        <w:jc w:val="both"/>
+      </w:pPr>
+      <w:r>
+        <w:rPr>
+          <w:rFonts w:ascii="宋体" w:hAnsi="宋体" w:eastAsia="宋体"/>
+          <w:sz w:val="23"/>
+        </w:rPr>
+        <w:t>本软件围绕匿名心理关怀场景建设，提供匿名登录、恢复密钥、投石表达、湖面浏览、涟漪共鸣、纸船回应、好友关系、通知中心、情绪日历、情绪趋势、安全港湾、灯火计划、湖神陪伴、内容审核、后台运营管理和实时广播等功能。</w:t>
+      </w:r>
+    </w:p>
+    <w:p>
+      <w:pPr>
+        <w:ind w:firstLine="420"/>
+        <w:jc w:val="both"/>
+      </w:pPr>
+      <w:r>
+        <w:rPr>
+          <w:rFonts w:ascii="宋体" w:hAnsi="宋体" w:eastAsia="宋体"/>
+          <w:sz w:val="23"/>
+        </w:rPr>
+        <w:t>系统采用 Flutter 移动端与 Web 端、Vue 管理后台、C++ Drogon 后端服务、PostgreSQL 数据库和 Redis 缓存的组合架构。后端接口已包含认证、账号管理、内容交互、推荐、风控、数据导出、管理统计与 WebSocket 广播模块。</w:t>
       </w:r>
     </w:p>
     <w:tbl>
       <w:tblPr>
         <w:tblStyle w:val="TableGrid"/>
         <w:tblW w:type="auto" w:w="0"/>
-        <w:jc w:val="center"/>
         <w:tblLook w:firstColumn="1" w:firstRow="1" w:lastColumn="0" w:lastRow="0" w:noHBand="0" w:noVBand="1" w:val="04A0"/>
       </w:tblPr>
       <w:tblGrid>
-        <w:gridCol w:w="4621"/>
-        <w:gridCol w:w="4621"/>
+        <w:gridCol w:w="4592"/>
+        <w:gridCol w:w="4592"/>
       </w:tblGrid>
       <w:tr>
         <w:tc>
           <w:tcPr>
             <w:tcW w:type="dxa" w:w="2268"/>
-            <w:shd w:fill="F2F2F2"/>
-            <w:vAlign w:val="center"/>
+            <w:shd w:fill="EAF3F0"/>
           </w:tcPr>
           <w:p>
             <w:pPr>
-              <w:spacing w:after="0"/>
+              <w:jc w:val="center"/>
             </w:pPr>
             <w:r>
               <w:rPr>
-                <w:rFonts w:ascii="宋体" w:hAnsi="宋体" w:eastAsia="宋体"/>
+                <w:rFonts w:ascii="黑体" w:hAnsi="黑体" w:eastAsia="黑体"/>
                 <w:b/>
                 <w:sz w:val="21"/>
               </w:rPr>
-              <w:t>第一著作权人</w:t>
+              <w:t>维度</w:t>
             </w:r>
           </w:p>
         </w:tc>
         <w:tc>
           <w:tcPr>
-            <w:tcW w:type="dxa" w:w="6463"/>
-            <w:vAlign w:val="center"/>
+            <w:tcW w:type="dxa" w:w="6236"/>
+            <w:shd w:fill="EAF3F0"/>
           </w:tcPr>
           <w:p>
             <w:pPr>
-              <w:spacing w:after="0"/>
+              <w:jc w:val="center"/>
             </w:pPr>
             <w:r>
               <w:rPr>
-                <w:rFonts w:ascii="宋体" w:hAnsi="宋体" w:eastAsia="宋体"/>
-                <w:b w:val="0"/>
+                <w:rFonts w:ascii="黑体" w:hAnsi="黑体" w:eastAsia="黑体"/>
+                <w:b/>
                 <w:sz w:val="21"/>
               </w:rPr>
-              <w:t>姓名或名称：（请填写著作权人姓名）</w:t>
-            </w:r>
-            <w:r>
-              <w:br/>
-            </w:r>
-            <w:r>
-              <w:rPr>
-                <w:rFonts w:ascii="宋体" w:hAnsi="宋体" w:eastAsia="宋体"/>
-                <w:b w:val="0"/>
-                <w:sz w:val="21"/>
-              </w:rPr>
-              <w:t>证件类型：中华人民共和国居民身份证</w:t>
-            </w:r>
-            <w:r>
-              <w:br/>
-            </w:r>
-            <w:r>
-              <w:rPr>
-                <w:rFonts w:ascii="宋体" w:hAnsi="宋体" w:eastAsia="宋体"/>
-                <w:b w:val="0"/>
-                <w:sz w:val="21"/>
-              </w:rPr>
-              <w:t>证件号码：（请填写身份证号码）</w:t>
-            </w:r>
-            <w:r>
-              <w:br/>
-            </w:r>
-            <w:r>
-              <w:rPr>
-                <w:rFonts w:ascii="宋体" w:hAnsi="宋体" w:eastAsia="宋体"/>
-                <w:b w:val="0"/>
-                <w:sz w:val="21"/>
-              </w:rPr>
-              <w:t>省份/城市：安徽省 / 芜湖市</w:t>
+              <w:t>实际情况</w:t>
             </w:r>
           </w:p>
         </w:tc>
@@ -517,77 +449,124 @@
         <w:tc>
           <w:tcPr>
             <w:tcW w:type="dxa" w:w="2268"/>
-            <w:shd w:fill="F2F2F2"/>
-            <w:vAlign w:val="center"/>
           </w:tcPr>
           <w:p>
-            <w:pPr>
-              <w:spacing w:after="0"/>
-            </w:pPr>
             <w:r>
               <w:rPr>
                 <w:rFonts w:ascii="宋体" w:hAnsi="宋体" w:eastAsia="宋体"/>
-                <w:b/>
-                <w:sz w:val="21"/>
+                <w:sz w:val="20"/>
               </w:rPr>
-              <w:t>团队成员预留</w:t>
+              <w:t>当前源码规模</w:t>
             </w:r>
           </w:p>
         </w:tc>
         <w:tc>
           <w:tcPr>
-            <w:tcW w:type="dxa" w:w="6463"/>
-            <w:vAlign w:val="center"/>
+            <w:tcW w:type="dxa" w:w="6236"/>
           </w:tcPr>
           <w:p>
-            <w:pPr>
-              <w:spacing w:after="0"/>
-            </w:pPr>
             <w:r>
               <w:rPr>
                 <w:rFonts w:ascii="宋体" w:hAnsi="宋体" w:eastAsia="宋体"/>
-                <w:b w:val="0"/>
-                <w:sz w:val="21"/>
+                <w:sz w:val="20"/>
               </w:rPr>
-              <w:t>成员1：________________  身份证号：________________</w:t>
+              <w:t>391 个源码/配置文件，约 108,733 行有效源文件内容</w:t>
             </w:r>
-            <w:r>
-              <w:br/>
-            </w:r>
+          </w:p>
+        </w:tc>
+      </w:tr>
+      <w:tr>
+        <w:tc>
+          <w:tcPr>
+            <w:tcW w:type="dxa" w:w="2268"/>
+          </w:tcPr>
+          <w:p>
             <w:r>
               <w:rPr>
                 <w:rFonts w:ascii="宋体" w:hAnsi="宋体" w:eastAsia="宋体"/>
-                <w:b w:val="0"/>
-                <w:sz w:val="21"/>
+                <w:sz w:val="20"/>
               </w:rPr>
-              <w:t>成员2：________________  身份证号：________________</w:t>
+              <w:t>云端展示规模</w:t>
             </w:r>
-            <w:r>
-              <w:br/>
-            </w:r>
+          </w:p>
+        </w:tc>
+        <w:tc>
+          <w:tcPr>
+            <w:tcW w:type="dxa" w:w="6236"/>
+          </w:tcPr>
+          <w:p>
             <w:r>
               <w:rPr>
                 <w:rFonts w:ascii="宋体" w:hAnsi="宋体" w:eastAsia="宋体"/>
-                <w:b w:val="0"/>
-                <w:sz w:val="21"/>
+                <w:sz w:val="20"/>
               </w:rPr>
-              <w:t>成员3：________________  身份证号：________________</w:t>
+              <w:t>公网湖面总石头 132 条，本次新增人工策划展示石头 96 条，展示身份 32 个</w:t>
             </w:r>
-            <w:r>
-              <w:br/>
-            </w:r>
+          </w:p>
+        </w:tc>
+      </w:tr>
+      <w:tr>
+        <w:tc>
+          <w:tcPr>
+            <w:tcW w:type="dxa" w:w="2268"/>
+          </w:tcPr>
+          <w:p>
             <w:r>
               <w:rPr>
                 <w:rFonts w:ascii="宋体" w:hAnsi="宋体" w:eastAsia="宋体"/>
-                <w:b w:val="0"/>
-                <w:sz w:val="21"/>
+                <w:sz w:val="20"/>
               </w:rPr>
-              <w:t>教师/指导人预留：________________</w:t>
+              <w:t>本地种子数据规模</w:t>
+            </w:r>
+          </w:p>
+        </w:tc>
+        <w:tc>
+          <w:tcPr>
+            <w:tcW w:type="dxa" w:w="6236"/>
+          </w:tcPr>
+          <w:p>
+            <w:r>
+              <w:rPr>
+                <w:rFonts w:ascii="宋体" w:hAnsi="宋体" w:eastAsia="宋体"/>
+                <w:sz w:val="20"/>
+              </w:rPr>
+              <w:t>32 个展示用户、96 条石头、282 条涟漪、48 条纸船、330 条互动历史、96 条情绪历史</w:t>
+            </w:r>
+          </w:p>
+        </w:tc>
+      </w:tr>
+      <w:tr>
+        <w:tc>
+          <w:tcPr>
+            <w:tcW w:type="dxa" w:w="2268"/>
+          </w:tcPr>
+          <w:p>
+            <w:r>
+              <w:rPr>
+                <w:rFonts w:ascii="宋体" w:hAnsi="宋体" w:eastAsia="宋体"/>
+                <w:sz w:val="20"/>
+              </w:rPr>
+              <w:t>质量验证</w:t>
+            </w:r>
+          </w:p>
+        </w:tc>
+        <w:tc>
+          <w:tcPr>
+            <w:tcW w:type="dxa" w:w="6236"/>
+          </w:tcPr>
+          <w:p>
+            <w:r>
+              <w:rPr>
+                <w:rFonts w:ascii="宋体" w:hAnsi="宋体" w:eastAsia="宋体"/>
+                <w:sz w:val="20"/>
+              </w:rPr>
+              <w:t>后端 CMake 构建、Flutter analyze、Flutter Web 构建、后台 Vite 构建已通过；种子 SQL 已在临时 PostgreSQL 容器完成迁移和落库验证。</w:t>
             </w:r>
           </w:p>
         </w:tc>
       </w:tr>
     </w:tbl>
+    <w:p/>
     <w:p>
       <w:pPr>
         <w:pStyle w:val="Heading1"/>
@@ -596,59 +575,70 @@
         <w:rPr>
           <w:rFonts w:ascii="黑体" w:hAnsi="黑体" w:eastAsia="黑体"/>
           <w:b/>
-          <w:sz w:val="32"/>
+          <w:sz w:val="30"/>
         </w:rPr>
-        <w:t>三、权利说明</w:t>
+        <w:t>三、申请人信息</w:t>
+      </w:r>
+    </w:p>
+    <w:p>
+      <w:pPr>
+        <w:ind w:firstLine="420"/>
+        <w:jc w:val="both"/>
+      </w:pPr>
+      <w:r>
+        <w:rPr>
+          <w:rFonts w:ascii="宋体" w:hAnsi="宋体" w:eastAsia="宋体"/>
+          <w:sz w:val="23"/>
+        </w:rPr>
+        <w:t>申请人、证件号码、联系人、联系电话、通讯地址等身份信息涉及真实主体资料，本文件保留填写位置，提交前应由申请人按国家版权登记平台要求填写真实有效信息。</w:t>
       </w:r>
     </w:p>
     <w:tbl>
       <w:tblPr>
         <w:tblStyle w:val="TableGrid"/>
         <w:tblW w:type="auto" w:w="0"/>
-        <w:jc w:val="center"/>
         <w:tblLook w:firstColumn="1" w:firstRow="1" w:lastColumn="0" w:lastRow="0" w:noHBand="0" w:noVBand="1" w:val="04A0"/>
       </w:tblPr>
       <w:tblGrid>
-        <w:gridCol w:w="4621"/>
-        <w:gridCol w:w="4621"/>
+        <w:gridCol w:w="4592"/>
+        <w:gridCol w:w="4592"/>
       </w:tblGrid>
       <w:tr>
         <w:tc>
           <w:tcPr>
             <w:tcW w:type="dxa" w:w="2268"/>
-            <w:shd w:fill="F2F2F2"/>
-            <w:vAlign w:val="center"/>
+            <w:shd w:fill="EAF3F0"/>
           </w:tcPr>
           <w:p>
             <w:pPr>
-              <w:spacing w:after="0"/>
+              <w:jc w:val="center"/>
             </w:pPr>
             <w:r>
               <w:rPr>
-                <w:rFonts w:ascii="宋体" w:hAnsi="宋体" w:eastAsia="宋体"/>
+                <w:rFonts w:ascii="黑体" w:hAnsi="黑体" w:eastAsia="黑体"/>
                 <w:b/>
                 <w:sz w:val="21"/>
               </w:rPr>
-              <w:t>权利取得方式</w:t>
+              <w:t>字段</w:t>
             </w:r>
           </w:p>
         </w:tc>
         <w:tc>
           <w:tcPr>
-            <w:tcW w:type="dxa" w:w="6463"/>
-            <w:vAlign w:val="center"/>
+            <w:tcW w:type="dxa" w:w="6236"/>
+            <w:shd w:fill="EAF3F0"/>
           </w:tcPr>
           <w:p>
             <w:pPr>
-              <w:spacing w:after="0"/>
+              <w:jc w:val="center"/>
             </w:pPr>
             <w:r>
               <w:rPr>
-                <w:rFonts w:ascii="宋体" w:hAnsi="宋体" w:eastAsia="宋体"/>
-                <w:b w:val="0"/>
+                <w:rFonts w:ascii="黑体" w:hAnsi="黑体" w:eastAsia="黑体"/>
+                <w:b/>
                 <w:sz w:val="21"/>
               </w:rPr>
-              <w:t>☑ 原始取得  □ 继受取得</w:t>
+              <w:t>填写内容</w:t>
             </w:r>
           </w:p>
         </w:tc>
@@ -657,39 +647,28 @@
         <w:tc>
           <w:tcPr>
             <w:tcW w:type="dxa" w:w="2268"/>
-            <w:shd w:fill="F2F2F2"/>
-            <w:vAlign w:val="center"/>
           </w:tcPr>
           <w:p>
-            <w:pPr>
-              <w:spacing w:after="0"/>
-            </w:pPr>
             <w:r>
               <w:rPr>
                 <w:rFonts w:ascii="宋体" w:hAnsi="宋体" w:eastAsia="宋体"/>
-                <w:b/>
-                <w:sz w:val="21"/>
+                <w:sz w:val="20"/>
               </w:rPr>
-              <w:t>权利范围</w:t>
+              <w:t>著作权人</w:t>
             </w:r>
           </w:p>
         </w:tc>
         <w:tc>
           <w:tcPr>
-            <w:tcW w:type="dxa" w:w="6463"/>
-            <w:vAlign w:val="center"/>
+            <w:tcW w:type="dxa" w:w="6236"/>
           </w:tcPr>
           <w:p>
-            <w:pPr>
-              <w:spacing w:after="0"/>
-            </w:pPr>
             <w:r>
               <w:rPr>
                 <w:rFonts w:ascii="宋体" w:hAnsi="宋体" w:eastAsia="宋体"/>
-                <w:b w:val="0"/>
-                <w:sz w:val="21"/>
+                <w:sz w:val="20"/>
               </w:rPr>
-              <w:t>☑ 全部权利</w:t>
+              <w:t>【提交前填写真实姓名或单位名称】</w:t>
             </w:r>
           </w:p>
         </w:tc>
@@ -698,105 +677,28 @@
         <w:tc>
           <w:tcPr>
             <w:tcW w:type="dxa" w:w="2268"/>
-            <w:shd w:fill="F2F2F2"/>
-            <w:vAlign w:val="center"/>
           </w:tcPr>
           <w:p>
-            <w:pPr>
-              <w:spacing w:after="0"/>
-            </w:pPr>
             <w:r>
               <w:rPr>
                 <w:rFonts w:ascii="宋体" w:hAnsi="宋体" w:eastAsia="宋体"/>
-                <w:b/>
-                <w:sz w:val="21"/>
+                <w:sz w:val="20"/>
               </w:rPr>
-              <w:t>软件鉴别材料</w:t>
+              <w:t>证件类型及号码</w:t>
             </w:r>
           </w:p>
         </w:tc>
         <w:tc>
           <w:tcPr>
-            <w:tcW w:type="dxa" w:w="6463"/>
-            <w:vAlign w:val="center"/>
+            <w:tcW w:type="dxa" w:w="6236"/>
           </w:tcPr>
           <w:p>
-            <w:pPr>
-              <w:spacing w:after="0"/>
-            </w:pPr>
             <w:r>
               <w:rPr>
                 <w:rFonts w:ascii="宋体" w:hAnsi="宋体" w:eastAsia="宋体"/>
-                <w:b w:val="0"/>
-                <w:sz w:val="21"/>
+                <w:sz w:val="20"/>
               </w:rPr>
-              <w:t>☑ 一般交存：提交源程序前连续30页和后连续30页；提交一种文档的前连续30页和后连续30页。</w:t>
-            </w:r>
-          </w:p>
-        </w:tc>
-      </w:tr>
-    </w:tbl>
-    <w:p>
-      <w:pPr>
-        <w:pStyle w:val="Heading1"/>
-      </w:pPr>
-      <w:r>
-        <w:rPr>
-          <w:rFonts w:ascii="黑体" w:hAnsi="黑体" w:eastAsia="黑体"/>
-          <w:b/>
-          <w:sz w:val="32"/>
-        </w:rPr>
-        <w:t>四、软件功能和技术特点</w:t>
-      </w:r>
-    </w:p>
-    <w:tbl>
-      <w:tblPr>
-        <w:tblStyle w:val="TableGrid"/>
-        <w:tblW w:type="auto" w:w="0"/>
-        <w:jc w:val="center"/>
-        <w:tblLook w:firstColumn="1" w:firstRow="1" w:lastColumn="0" w:lastRow="0" w:noHBand="0" w:noVBand="1" w:val="04A0"/>
-      </w:tblPr>
-      <w:tblGrid>
-        <w:gridCol w:w="4621"/>
-        <w:gridCol w:w="4621"/>
-      </w:tblGrid>
-      <w:tr>
-        <w:tc>
-          <w:tcPr>
-            <w:tcW w:type="dxa" w:w="2268"/>
-            <w:shd w:fill="F2F2F2"/>
-            <w:vAlign w:val="center"/>
-          </w:tcPr>
-          <w:p>
-            <w:pPr>
-              <w:spacing w:after="0"/>
-            </w:pPr>
-            <w:r>
-              <w:rPr>
-                <w:rFonts w:ascii="宋体" w:hAnsi="宋体" w:eastAsia="宋体"/>
-                <w:b/>
-                <w:sz w:val="21"/>
-              </w:rPr>
-              <w:t>开发的硬件环境</w:t>
-            </w:r>
-          </w:p>
-        </w:tc>
-        <w:tc>
-          <w:tcPr>
-            <w:tcW w:type="dxa" w:w="6463"/>
-            <w:vAlign w:val="center"/>
-          </w:tcPr>
-          <w:p>
-            <w:pPr>
-              <w:spacing w:after="0"/>
-            </w:pPr>
-            <w:r>
-              <w:rPr>
-                <w:rFonts w:ascii="宋体" w:hAnsi="宋体" w:eastAsia="宋体"/>
-                <w:b w:val="0"/>
-                <w:sz w:val="21"/>
-              </w:rPr>
-              <w:t>x86_64 工作站；CPU 多核处理器；内存 16GB 及以上；硬盘 500GB 及以上。本次本地复核环境为 Fedora Linux 43。</w:t>
+              <w:t>【提交前填写】</w:t>
             </w:r>
           </w:p>
         </w:tc>
@@ -805,39 +707,28 @@
         <w:tc>
           <w:tcPr>
             <w:tcW w:type="dxa" w:w="2268"/>
-            <w:shd w:fill="F2F2F2"/>
-            <w:vAlign w:val="center"/>
           </w:tcPr>
           <w:p>
-            <w:pPr>
-              <w:spacing w:after="0"/>
-            </w:pPr>
             <w:r>
               <w:rPr>
                 <w:rFonts w:ascii="宋体" w:hAnsi="宋体" w:eastAsia="宋体"/>
-                <w:b/>
-                <w:sz w:val="21"/>
+                <w:sz w:val="20"/>
               </w:rPr>
-              <w:t>运行的硬件环境</w:t>
+              <w:t>联系人</w:t>
             </w:r>
           </w:p>
         </w:tc>
         <w:tc>
           <w:tcPr>
-            <w:tcW w:type="dxa" w:w="6463"/>
-            <w:vAlign w:val="center"/>
+            <w:tcW w:type="dxa" w:w="6236"/>
           </w:tcPr>
           <w:p>
-            <w:pPr>
-              <w:spacing w:after="0"/>
-            </w:pPr>
             <w:r>
               <w:rPr>
                 <w:rFonts w:ascii="宋体" w:hAnsi="宋体" w:eastAsia="宋体"/>
-                <w:b w:val="0"/>
-                <w:sz w:val="21"/>
+                <w:sz w:val="20"/>
               </w:rPr>
-              <w:t>云服务器 2核2GB 及以上；Android 移动设备；PC 浏览器管理端。</w:t>
+              <w:t>【提交前填写】</w:t>
             </w:r>
           </w:p>
         </w:tc>
@@ -846,39 +737,28 @@
         <w:tc>
           <w:tcPr>
             <w:tcW w:type="dxa" w:w="2268"/>
-            <w:shd w:fill="F2F2F2"/>
-            <w:vAlign w:val="center"/>
           </w:tcPr>
           <w:p>
-            <w:pPr>
-              <w:spacing w:after="0"/>
-            </w:pPr>
             <w:r>
               <w:rPr>
                 <w:rFonts w:ascii="宋体" w:hAnsi="宋体" w:eastAsia="宋体"/>
-                <w:b/>
-                <w:sz w:val="21"/>
+                <w:sz w:val="20"/>
               </w:rPr>
-              <w:t>开发该软件的操作系统</w:t>
+              <w:t>联系电话</w:t>
             </w:r>
           </w:p>
         </w:tc>
         <w:tc>
           <w:tcPr>
-            <w:tcW w:type="dxa" w:w="6463"/>
-            <w:vAlign w:val="center"/>
+            <w:tcW w:type="dxa" w:w="6236"/>
           </w:tcPr>
           <w:p>
-            <w:pPr>
-              <w:spacing w:after="0"/>
-            </w:pPr>
             <w:r>
               <w:rPr>
                 <w:rFonts w:ascii="宋体" w:hAnsi="宋体" w:eastAsia="宋体"/>
-                <w:b w:val="0"/>
-                <w:sz w:val="21"/>
+                <w:sz w:val="20"/>
               </w:rPr>
-              <w:t>Fedora Linux 43、Linux 云服务器环境，兼容 Windows/Android 构建链。</w:t>
+              <w:t>【提交前填写】</w:t>
             </w:r>
           </w:p>
         </w:tc>
@@ -887,419 +767,37 @@
         <w:tc>
           <w:tcPr>
             <w:tcW w:type="dxa" w:w="2268"/>
-            <w:shd w:fill="F2F2F2"/>
-            <w:vAlign w:val="center"/>
           </w:tcPr>
           <w:p>
-            <w:pPr>
-              <w:spacing w:after="0"/>
-            </w:pPr>
             <w:r>
               <w:rPr>
                 <w:rFonts w:ascii="宋体" w:hAnsi="宋体" w:eastAsia="宋体"/>
-                <w:b/>
-                <w:sz w:val="21"/>
+                <w:sz w:val="20"/>
               </w:rPr>
-              <w:t>软件开发环境/开发工具</w:t>
+              <w:t>通讯地址</w:t>
             </w:r>
           </w:p>
         </w:tc>
         <w:tc>
           <w:tcPr>
-            <w:tcW w:type="dxa" w:w="6463"/>
-            <w:vAlign w:val="center"/>
+            <w:tcW w:type="dxa" w:w="6236"/>
           </w:tcPr>
           <w:p>
-            <w:pPr>
-              <w:spacing w:after="0"/>
-            </w:pPr>
             <w:r>
               <w:rPr>
                 <w:rFonts w:ascii="宋体" w:hAnsi="宋体" w:eastAsia="宋体"/>
-                <w:b w:val="0"/>
-                <w:sz w:val="21"/>
+                <w:sz w:val="20"/>
               </w:rPr>
-              <w:t>Drogon 1.9.12、C++20、CMake 3.31、GCC 15、Flutter 3.41.7、Dart 3.11.5、Android SDK 36、OpenJDK 21、Node.js、Vite 8、Vue 3、PostgreSQL、Redis、Nginx。</w:t>
-            </w:r>
-          </w:p>
-        </w:tc>
-      </w:tr>
-      <w:tr>
-        <w:tc>
-          <w:tcPr>
-            <w:tcW w:type="dxa" w:w="2268"/>
-            <w:shd w:fill="F2F2F2"/>
-            <w:vAlign w:val="center"/>
-          </w:tcPr>
-          <w:p>
-            <w:pPr>
-              <w:spacing w:after="0"/>
-            </w:pPr>
-            <w:r>
-              <w:rPr>
-                <w:rFonts w:ascii="宋体" w:hAnsi="宋体" w:eastAsia="宋体"/>
-                <w:b/>
-                <w:sz w:val="21"/>
-              </w:rPr>
-              <w:t>运行平台/操作系统</w:t>
-            </w:r>
-          </w:p>
-        </w:tc>
-        <w:tc>
-          <w:tcPr>
-            <w:tcW w:type="dxa" w:w="6463"/>
-            <w:vAlign w:val="center"/>
-          </w:tcPr>
-          <w:p>
-            <w:pPr>
-              <w:spacing w:after="0"/>
-            </w:pPr>
-            <w:r>
-              <w:rPr>
-                <w:rFonts w:ascii="宋体" w:hAnsi="宋体" w:eastAsia="宋体"/>
-                <w:b w:val="0"/>
-                <w:sz w:val="21"/>
-              </w:rPr>
-              <w:t>服务端 Linux 64位；移动端 Android；管理端 Chrome/Edge/Firefox 等现代浏览器。</w:t>
-            </w:r>
-          </w:p>
-        </w:tc>
-      </w:tr>
-      <w:tr>
-        <w:tc>
-          <w:tcPr>
-            <w:tcW w:type="dxa" w:w="2268"/>
-            <w:shd w:fill="F2F2F2"/>
-            <w:vAlign w:val="center"/>
-          </w:tcPr>
-          <w:p>
-            <w:pPr>
-              <w:spacing w:after="0"/>
-            </w:pPr>
-            <w:r>
-              <w:rPr>
-                <w:rFonts w:ascii="宋体" w:hAnsi="宋体" w:eastAsia="宋体"/>
-                <w:b/>
-                <w:sz w:val="21"/>
-              </w:rPr>
-              <w:t>运行支撑环境/支持软件</w:t>
-            </w:r>
-          </w:p>
-        </w:tc>
-        <w:tc>
-          <w:tcPr>
-            <w:tcW w:type="dxa" w:w="6463"/>
-            <w:vAlign w:val="center"/>
-          </w:tcPr>
-          <w:p>
-            <w:pPr>
-              <w:spacing w:after="0"/>
-            </w:pPr>
-            <w:r>
-              <w:rPr>
-                <w:rFonts w:ascii="宋体" w:hAnsi="宋体" w:eastAsia="宋体"/>
-                <w:b w:val="0"/>
-                <w:sz w:val="21"/>
-              </w:rPr>
-              <w:t>Nginx 网关、Drogon Runtime、PostgreSQL、Redis、OpenSSL、CURL、Flutter Runtime、浏览器 JavaScript 引擎。</w:t>
-            </w:r>
-          </w:p>
-        </w:tc>
-      </w:tr>
-      <w:tr>
-        <w:tc>
-          <w:tcPr>
-            <w:tcW w:type="dxa" w:w="2268"/>
-            <w:shd w:fill="F2F2F2"/>
-            <w:vAlign w:val="center"/>
-          </w:tcPr>
-          <w:p>
-            <w:pPr>
-              <w:spacing w:after="0"/>
-            </w:pPr>
-            <w:r>
-              <w:rPr>
-                <w:rFonts w:ascii="宋体" w:hAnsi="宋体" w:eastAsia="宋体"/>
-                <w:b/>
-                <w:sz w:val="21"/>
-              </w:rPr>
-              <w:t>编程语言</w:t>
-            </w:r>
-          </w:p>
-        </w:tc>
-        <w:tc>
-          <w:tcPr>
-            <w:tcW w:type="dxa" w:w="6463"/>
-            <w:vAlign w:val="center"/>
-          </w:tcPr>
-          <w:p>
-            <w:pPr>
-              <w:spacing w:after="0"/>
-            </w:pPr>
-            <w:r>
-              <w:rPr>
-                <w:rFonts w:ascii="宋体" w:hAnsi="宋体" w:eastAsia="宋体"/>
-                <w:b w:val="0"/>
-                <w:sz w:val="21"/>
-              </w:rPr>
-              <w:t>C++20、Dart、TypeScript、Vue、SQL、Shell、Python、Gradle。</w:t>
-            </w:r>
-          </w:p>
-        </w:tc>
-      </w:tr>
-      <w:tr>
-        <w:tc>
-          <w:tcPr>
-            <w:tcW w:type="dxa" w:w="2268"/>
-            <w:shd w:fill="F2F2F2"/>
-            <w:vAlign w:val="center"/>
-          </w:tcPr>
-          <w:p>
-            <w:pPr>
-              <w:spacing w:after="0"/>
-            </w:pPr>
-            <w:r>
-              <w:rPr>
-                <w:rFonts w:ascii="宋体" w:hAnsi="宋体" w:eastAsia="宋体"/>
-                <w:b/>
-                <w:sz w:val="21"/>
-              </w:rPr>
-              <w:t>源程序量</w:t>
-            </w:r>
-          </w:p>
-        </w:tc>
-        <w:tc>
-          <w:tcPr>
-            <w:tcW w:type="dxa" w:w="6463"/>
-            <w:vAlign w:val="center"/>
-          </w:tcPr>
-          <w:p>
-            <w:pPr>
-              <w:spacing w:after="0"/>
-            </w:pPr>
-            <w:r>
-              <w:rPr>
-                <w:rFonts w:ascii="宋体" w:hAnsi="宋体" w:eastAsia="宋体"/>
-                <w:b w:val="0"/>
-                <w:sz w:val="21"/>
-              </w:rPr>
-              <w:t>112344 行（按当前 codee/HeartLake 仓库源码统计）</w:t>
-            </w:r>
-          </w:p>
-        </w:tc>
-      </w:tr>
-      <w:tr>
-        <w:tc>
-          <w:tcPr>
-            <w:tcW w:type="dxa" w:w="2268"/>
-            <w:shd w:fill="F2F2F2"/>
-            <w:vAlign w:val="center"/>
-          </w:tcPr>
-          <w:p>
-            <w:pPr>
-              <w:spacing w:after="0"/>
-            </w:pPr>
-            <w:r>
-              <w:rPr>
-                <w:rFonts w:ascii="宋体" w:hAnsi="宋体" w:eastAsia="宋体"/>
-                <w:b/>
-                <w:sz w:val="21"/>
-              </w:rPr>
-              <w:t>开发目的</w:t>
-            </w:r>
-          </w:p>
-        </w:tc>
-        <w:tc>
-          <w:tcPr>
-            <w:tcW w:type="dxa" w:w="6463"/>
-            <w:vAlign w:val="center"/>
-          </w:tcPr>
-          <w:p>
-            <w:pPr>
-              <w:spacing w:after="0"/>
-            </w:pPr>
-            <w:r>
-              <w:rPr>
-                <w:rFonts w:ascii="宋体" w:hAnsi="宋体" w:eastAsia="宋体"/>
-                <w:b w:val="0"/>
-                <w:sz w:val="21"/>
-              </w:rPr>
-              <w:t>建设一套匿名情绪表达与心理关怀系统，降低用户表达心理压力，提供内容共鸣、温和回应、情绪记录、安全资源、AI 陪伴和后台治理能力。</w:t>
-            </w:r>
-          </w:p>
-        </w:tc>
-      </w:tr>
-      <w:tr>
-        <w:tc>
-          <w:tcPr>
-            <w:tcW w:type="dxa" w:w="2268"/>
-            <w:shd w:fill="F2F2F2"/>
-            <w:vAlign w:val="center"/>
-          </w:tcPr>
-          <w:p>
-            <w:pPr>
-              <w:spacing w:after="0"/>
-            </w:pPr>
-            <w:r>
-              <w:rPr>
-                <w:rFonts w:ascii="宋体" w:hAnsi="宋体" w:eastAsia="宋体"/>
-                <w:b/>
-                <w:sz w:val="21"/>
-              </w:rPr>
-              <w:t>面向领域/行业</w:t>
-            </w:r>
-          </w:p>
-        </w:tc>
-        <w:tc>
-          <w:tcPr>
-            <w:tcW w:type="dxa" w:w="6463"/>
-            <w:vAlign w:val="center"/>
-          </w:tcPr>
-          <w:p>
-            <w:pPr>
-              <w:spacing w:after="0"/>
-            </w:pPr>
-            <w:r>
-              <w:rPr>
-                <w:rFonts w:ascii="宋体" w:hAnsi="宋体" w:eastAsia="宋体"/>
-                <w:b w:val="0"/>
-                <w:sz w:val="21"/>
-              </w:rPr>
-              <w:t>心理健康服务、校园心理支持、匿名社区、移动互联网内容互动、智能内容治理。</w:t>
-            </w:r>
-          </w:p>
-        </w:tc>
-      </w:tr>
-      <w:tr>
-        <w:tc>
-          <w:tcPr>
-            <w:tcW w:type="dxa" w:w="2268"/>
-            <w:shd w:fill="F2F2F2"/>
-            <w:vAlign w:val="center"/>
-          </w:tcPr>
-          <w:p>
-            <w:pPr>
-              <w:spacing w:after="0"/>
-            </w:pPr>
-            <w:r>
-              <w:rPr>
-                <w:rFonts w:ascii="宋体" w:hAnsi="宋体" w:eastAsia="宋体"/>
-                <w:b/>
-                <w:sz w:val="21"/>
-              </w:rPr>
-              <w:t>软件主要功能</w:t>
-            </w:r>
-          </w:p>
-        </w:tc>
-        <w:tc>
-          <w:tcPr>
-            <w:tcW w:type="dxa" w:w="6463"/>
-            <w:vAlign w:val="center"/>
-          </w:tcPr>
-          <w:p>
-            <w:pPr>
-              <w:spacing w:after="0"/>
-            </w:pPr>
-            <w:r>
-              <w:rPr>
-                <w:rFonts w:ascii="宋体" w:hAnsi="宋体" w:eastAsia="宋体"/>
-                <w:b w:val="0"/>
-                <w:sz w:val="21"/>
-              </w:rPr>
-              <w:t>匿名登录与恢复密钥、观湖内容流、投石发布、涟漪共鸣、纸船回应、好友和临时好友、通知中心、情绪日历/趋势/热力图、安全港、心理咨询、湖神聊天、隐私设置、数据导出、管理后台、内容审核、举报处理、Edge AI 管理、WebSocket 实时广播。</w:t>
-            </w:r>
-          </w:p>
-        </w:tc>
-      </w:tr>
-      <w:tr>
-        <w:tc>
-          <w:tcPr>
-            <w:tcW w:type="dxa" w:w="2268"/>
-            <w:shd w:fill="F2F2F2"/>
-            <w:vAlign w:val="center"/>
-          </w:tcPr>
-          <w:p>
-            <w:pPr>
-              <w:spacing w:after="0"/>
-            </w:pPr>
-            <w:r>
-              <w:rPr>
-                <w:rFonts w:ascii="宋体" w:hAnsi="宋体" w:eastAsia="宋体"/>
-                <w:b/>
-                <w:sz w:val="21"/>
-              </w:rPr>
-              <w:t>软件技术特点</w:t>
-            </w:r>
-          </w:p>
-        </w:tc>
-        <w:tc>
-          <w:tcPr>
-            <w:tcW w:type="dxa" w:w="6463"/>
-            <w:vAlign w:val="center"/>
-          </w:tcPr>
-          <w:p>
-            <w:pPr>
-              <w:spacing w:after="0"/>
-            </w:pPr>
-            <w:r>
-              <w:rPr>
-                <w:rFonts w:ascii="宋体" w:hAnsi="宋体" w:eastAsia="宋体"/>
-                <w:b w:val="0"/>
-                <w:sz w:val="21"/>
-              </w:rPr>
-              <w:t>1. Flutter 移动端、Vue 3 管理端、Drogon C++20 后端分层实现。</w:t>
-            </w:r>
-            <w:r>
-              <w:br/>
-            </w:r>
-            <w:r>
-              <w:rPr>
-                <w:rFonts w:ascii="宋体" w:hAnsi="宋体" w:eastAsia="宋体"/>
-                <w:b w:val="0"/>
-                <w:sz w:val="21"/>
-              </w:rPr>
-              <w:t>2. PASETO 会话、恢复密钥、RBAC、安全审计和隐私设置形成安全链路。</w:t>
-            </w:r>
-            <w:r>
-              <w:br/>
-            </w:r>
-            <w:r>
-              <w:rPr>
-                <w:rFonts w:ascii="宋体" w:hAnsi="宋体" w:eastAsia="宋体"/>
-                <w:b w:val="0"/>
-                <w:sz w:val="21"/>
-              </w:rPr>
-              <w:t>3. WebSocket 实时广播和 PostgreSQL/Redis 支撑内容与通知同步。</w:t>
-            </w:r>
-            <w:r>
-              <w:br/>
-            </w:r>
-            <w:r>
-              <w:rPr>
-                <w:rFonts w:ascii="宋体" w:hAnsi="宋体" w:eastAsia="宋体"/>
-                <w:b w:val="0"/>
-                <w:sz w:val="21"/>
-              </w:rPr>
-              <w:t>4. Edge AI 子系统覆盖情绪分析、内容审核、情绪脉搏、联邦学习、差分隐私、向量检索、模型量化和节点监控。</w:t>
-            </w:r>
-            <w:r>
-              <w:br/>
-            </w:r>
-            <w:r>
-              <w:rPr>
-                <w:rFonts w:ascii="宋体" w:hAnsi="宋体" w:eastAsia="宋体"/>
-                <w:b w:val="0"/>
-                <w:sz w:val="21"/>
-              </w:rPr>
-              <w:t>5. 本地已完成后端、管理端、Flutter Web、Android APK 构建复核；APK SHA-256：436499405725ddd1f4f50f7d7f6e72492b5c48e7fc943fd7f4d36c168296625c</w:t>
+              <w:t>【提交前填写】</w:t>
             </w:r>
           </w:p>
         </w:tc>
       </w:tr>
     </w:tbl>
+    <w:p/>
     <w:sectPr>
       <w:pgSz w:w="11906" w:h="16838"/>
-      <w:pgMar w:top="1332" w:right="1332" w:bottom="1332" w:left="1332" w:header="720" w:footer="720" w:gutter="0"/>
+      <w:pgMar w:top="1361" w:right="1361" w:bottom="1247" w:left="1361" w:header="720" w:footer="720" w:gutter="0"/>
       <w:cols w:space="720"/>
       <w:docGrid w:linePitch="360"/>
     </w:sectPr>
@@ -1671,11 +1169,11 @@
     <w:qFormat/>
     <w:rsid w:val="00FC693F"/>
     <w:pPr>
-      <w:spacing w:line="360" w:lineRule="auto" w:after="120"/>
+      <w:spacing w:line="360" w:lineRule="auto" w:after="80"/>
     </w:pPr>
     <w:rPr>
       <w:rFonts w:ascii="宋体" w:hAnsi="宋体" w:eastAsia="宋体"/>
-      <w:sz w:val="24"/>
+      <w:sz w:val="23"/>
     </w:rPr>
   </w:style>
   <w:style w:type="paragraph" w:styleId="Header">
@@ -1741,7 +1239,7 @@
       <w:b/>
       <w:bCs/>
       <w:color w:val="365F91" w:themeColor="accent1" w:themeShade="BF"/>
-      <w:sz w:val="32"/>
+      <w:sz w:val="30"/>
       <w:szCs w:val="28"/>
     </w:rPr>
   </w:style>
@@ -1765,7 +1263,7 @@
       <w:b/>
       <w:bCs/>
       <w:color w:val="4F81BD" w:themeColor="accent1"/>
-      <w:sz w:val="28"/>
+      <w:sz w:val="26"/>
       <w:szCs w:val="26"/>
     </w:rPr>
   </w:style>

</xml_diff>